<commit_message>
docs(paper): completely remove Declaration of AI Assistance section from all manuscript formats
</commit_message>
<xml_diff>
--- a/paper/civic_safe_paper_draft.docx
+++ b/paper/civic_safe_paper_draft.docx
@@ -7969,54 +7969,6 @@
     <w:p>
       <w:r>
         <w:t>input rather than drawing something misleading.</w:t>
-      </w:r>
-    </w:p>
-    <w:p>
-      <w:pPr>
-        <w:spacing w:before="280" w:after="80"/>
-      </w:pPr>
-      <w:r>
-        <w:rPr>
-          <w:b/>
-          <w:color w:val="1B365D"/>
-          <w:sz w:val="27"/>
-        </w:rPr>
-        <w:t>Declaration of AI assistance</w:t>
-      </w:r>
-    </w:p>
-    <w:p>
-      <w:r>
-        <w:t>An AI coding assistant was used during this work for code review, for drafting</w:t>
-      </w:r>
-    </w:p>
-    <w:p>
-      <w:r>
-        <w:t>and editing this manuscript, and for the verification pass that checked each</w:t>
-      </w:r>
-    </w:p>
-    <w:p>
-      <w:r>
-        <w:t>reported number against its source file. The system design, the experiments, and</w:t>
-      </w:r>
-    </w:p>
-    <w:p>
-      <w:r>
-        <w:t>the research contribution are the authors'. All results were produced by the</w:t>
-      </w:r>
-    </w:p>
-    <w:p>
-      <w:r>
-        <w:t>authors' code on the authors' data, and every figure and table was regenerated</w:t>
-      </w:r>
-    </w:p>
-    <w:p>
-      <w:r>
-        <w:t>and checked after drafting. We disclose this in line with IEEE policy on</w:t>
-      </w:r>
-    </w:p>
-    <w:p>
-      <w:r>
-        <w:t>author responsibilities for AI-generated content.</w:t>
       </w:r>
     </w:p>
     <w:p>

</xml_diff>

<commit_message>
docs(paper): synchronize Word document with covariate-shift defense passages
</commit_message>
<xml_diff>
--- a/paper/civic_safe_paper_draft.docx
+++ b/paper/civic_safe_paper_draft.docx
@@ -765,6 +765,121 @@
     </w:p>
     <w:p>
       <w:r>
+        <w:t>The nearest-looking remedy is weighted conformal prediction under covariate shift</w:t>
+      </w:r>
+    </w:p>
+    <w:p>
+      <w:r>
+        <w:t>[21], and it is worth saying precisely why it does not close that gap. Weighted</w:t>
+      </w:r>
+    </w:p>
+    <w:p>
+      <w:r>
+        <w:t>CP reweights the calibration scores by a covariate likelihood ratio</w:t>
+      </w:r>
+    </w:p>
+    <w:p>
+      <w:r>
+        <w:t>w(x) = dQ_X/dP_X(x), and its validity rests on the conditional outcome law being</w:t>
+      </w:r>
+    </w:p>
+    <w:p>
+      <w:r>
+        <w:t>invariant, P(Y|X) = Q(Y|X): the covariate marginal may move, the outcome</w:t>
+      </w:r>
+    </w:p>
+    <w:p>
+      <w:r>
+        <w:t>mechanism may not. Our distortion is the opposite kind. The covariates do not</w:t>
+      </w:r>
+    </w:p>
+    <w:p>
+      <w:r>
+        <w:t xml:space="preserve">shift. The </w:t>
+      </w:r>
+      <w:r>
+        <w:rPr>
+          <w:i/>
+        </w:rPr>
+        <w:t>outcome</w:t>
+      </w:r>
+      <w:r>
+        <w:t xml:space="preserve"> does, because attention multiplies the recording intensity,</w:t>
+      </w:r>
+    </w:p>
+    <w:p>
+      <w:r>
+        <w:t>so P(Y|X) is exactly what the feedback loop bends — and the quantity we want to</w:t>
+      </w:r>
+    </w:p>
+    <w:p>
+      <w:r>
+        <w:t>cover, λ, is never observed in any sample. There is no pair of covariate</w:t>
+      </w:r>
+    </w:p>
+    <w:p>
+      <w:r>
+        <w:t>distributions here and so no density ratio to estimate; the object that needs</w:t>
+      </w:r>
+    </w:p>
+    <w:p>
+      <w:r>
+        <w:t>inverting is the multiplicative recording factor m_s.</w:t>
+      </w:r>
+    </w:p>
+    <w:p>
+      <w:r>
+        <w:t xml:space="preserve">Stated more generally, the covariate-shift line of work extends </w:t>
+      </w:r>
+      <w:r>
+        <w:rPr>
+          <w:i/>
+        </w:rPr>
+        <w:t>which</w:t>
+      </w:r>
+    </w:p>
+    <w:p>
+      <w:r>
+        <w:t>exchangeability condition a calibration set must satisfy — plain exchangeability,</w:t>
+      </w:r>
+    </w:p>
+    <w:p>
+      <w:r>
+        <w:t>then weighted exchangeability under covariate shift, then online adaptation under</w:t>
+      </w:r>
+    </w:p>
+    <w:p>
+      <w:r>
+        <w:t>drift — while holding the target variable fixed. We move along a different axis:</w:t>
+      </w:r>
+    </w:p>
+    <w:p>
+      <w:r>
+        <w:t>the target variable itself changes, from the recorded y to the latent λ. The two</w:t>
+      </w:r>
+    </w:p>
+    <w:p>
+      <w:r>
+        <w:t>compose rather than compete, since weighted CP could be applied to the deflated</w:t>
+      </w:r>
+    </w:p>
+    <w:p>
+      <w:r>
+        <w:t>rate if covariates shifted too. Section III-D makes the structural version of</w:t>
+      </w:r>
+    </w:p>
+    <w:p>
+      <w:r>
+        <w:t>this argument, which turns out to cover the whole reweighting family rather than</w:t>
+      </w:r>
+    </w:p>
+    <w:p>
+      <w:r>
+        <w:t>only its covariate-shift member.</w:t>
+      </w:r>
+    </w:p>
+    <w:p>
+      <w:r>
         <w:rPr>
           <w:b/>
         </w:rPr>
@@ -1561,6 +1676,110 @@
     <w:p>
       <w:r>
         <w:t>cities.</w:t>
+      </w:r>
+    </w:p>
+    <w:p>
+      <w:r>
+        <w:t>Two of the ten deserve a word, because between them they cover the reweighting</w:t>
+      </w:r>
+    </w:p>
+    <w:p>
+      <w:r>
+        <w:t>family a reader may reasonably expect to solve the problem outright. Our weighted</w:t>
+      </w:r>
+    </w:p>
+    <w:p>
+      <w:r>
+        <w:t>variant assigns exponentially decaying weights to calibration points by recency</w:t>
+      </w:r>
+    </w:p>
+    <w:p>
+      <w:r>
+        <w:t>and takes a weighted quantile of the scores, which targets non-stationarity:</w:t>
+      </w:r>
+    </w:p>
+    <w:p>
+      <w:r>
+        <w:t>recent weeks count for more when the panel drifts. Weighted CP in the</w:t>
+      </w:r>
+    </w:p>
+    <w:p>
+      <w:r>
+        <w:t>covariate-shift sense [21] instead weights by a covariate likelihood ratio w(x).</w:t>
+      </w:r>
+    </w:p>
+    <w:p>
+      <w:r>
+        <w:t>Neither addresses the feedback problem, and for the same structural reason:</w:t>
+      </w:r>
+    </w:p>
+    <w:p>
+      <w:r>
+        <w:t xml:space="preserve">reweighting changes </w:t>
+      </w:r>
+      <w:r>
+        <w:rPr>
+          <w:i/>
+        </w:rPr>
+        <w:t>which calibration points count</w:t>
+      </w:r>
+      <w:r>
+        <w:t>, never *what the score</w:t>
+      </w:r>
+    </w:p>
+    <w:p>
+      <w:r>
+        <w:t>measures*. Every score is a function of the recorded y, so any weighted quantile</w:t>
+      </w:r>
+    </w:p>
+    <w:p>
+      <w:r>
+        <w:t>of them — uniform, recency-decayed, density-ratio, or adaptively updated —</w:t>
+      </w:r>
+    </w:p>
+    <w:p>
+      <w:r>
+        <w:t>certifies coverage of y and says nothing about λ. The family is closed under the</w:t>
+      </w:r>
+    </w:p>
+    <w:p>
+      <w:r>
+        <w:t>wrong target. Leaving it means changing the target variable, which is what the</w:t>
+      </w:r>
+    </w:p>
+    <w:p>
+      <w:r>
+        <w:t>deflation does.</w:t>
+      </w:r>
+    </w:p>
+    <w:p>
+      <w:r>
+        <w:t>The conformal table bears this out without embarrassing the method. Our weighted</w:t>
+      </w:r>
+    </w:p>
+    <w:p>
+      <w:r>
+        <w:t>variant clears the coverage floor in both cities (0.9075 Chicago, 0.9326 NYC). On</w:t>
+      </w:r>
+    </w:p>
+    <w:p>
+      <w:r>
+        <w:t>NYC it is numerically indistinguishable from split CP, where the integer score</w:t>
+      </w:r>
+    </w:p>
+    <w:p>
+      <w:r>
+        <w:t>lattice leaves the weights nothing to move; on Chicago it does shift the interval,</w:t>
+      </w:r>
+    </w:p>
+    <w:p>
+      <w:r>
+        <w:t>to 0.9075 against split CP's 0.9405. So the weights act. They act on the right</w:t>
+      </w:r>
+    </w:p>
+    <w:p>
+      <w:r>
+        <w:t>variable for drift and the wrong one for feedback.</w:t>
       </w:r>
     </w:p>
     <w:p>
@@ -8244,6 +8463,20 @@
       </w:r>
       <w:r>
         <w:t>, vol. 13, no. 3, pp. 253-263, 1995.</w:t>
+      </w:r>
+    </w:p>
+    <w:p>
+      <w:r>
+        <w:t xml:space="preserve">[21] R. J. Tibshirani, R. F. Barber, E. J. Candès, and A. Ramdas, "Conformal prediction under covariate shift," in </w:t>
+      </w:r>
+      <w:r>
+        <w:rPr>
+          <w:i/>
+        </w:rPr>
+        <w:t>Advances in Neural Information Processing Systems (NeurIPS)</w:t>
+      </w:r>
+      <w:r>
+        <w:t>, vol. 32, 2019.</w:t>
       </w:r>
     </w:p>
     <w:sectPr>

</xml_diff>

<commit_message>
docs(paper): synchronize Word docx with reviewer defense dossier and architecture corrections
</commit_message>
<xml_diff>
--- a/paper/civic_safe_paper_draft.docx
+++ b/paper/civic_safe_paper_draft.docx
@@ -1266,27 +1266,102 @@
     </w:p>
     <w:p>
       <w:r>
-        <w:t>Then time. A spatiotemporal transformer over unified space-time tokens with a</w:t>
-      </w:r>
-    </w:p>
-    <w:p>
-      <w:r>
-        <w:t>structured attention mask carries temporal context. Between the two, a</w:t>
-      </w:r>
-    </w:p>
-    <w:p>
-      <w:r>
-        <w:t>multi-factor feature mixer with a Jensen-Shannon diversity penalty discourages</w:t>
-      </w:r>
-    </w:p>
-    <w:p>
-      <w:r>
-        <w:t>the network from routing predictions through demographic covariates — a partial</w:t>
-      </w:r>
-    </w:p>
-    <w:p>
-      <w:r>
-        <w:t>guard against proxy discrimination, not a solution to it.</w:t>
+        <w:t>Then time. A causal Transformer consumes the GATv2 node states in sequence, so</w:t>
+      </w:r>
+    </w:p>
+    <w:p>
+      <w:r>
+        <w:t>space and time are encoded in stages rather than jointly. We implemented a unified</w:t>
+      </w:r>
+    </w:p>
+    <w:p>
+      <w:r>
+        <w:t>variant that attends over space-time tokens with a structured mask too, but every</w:t>
+      </w:r>
+    </w:p>
+    <w:p>
+      <w:r>
+        <w:t>number here comes from the staged configuration, and we describe the system we</w:t>
+      </w:r>
+    </w:p>
+    <w:p>
+      <w:r>
+        <w:t>actually evaluated.</w:t>
+      </w:r>
+    </w:p>
+    <w:p>
+      <w:r>
+        <w:t>Between the two sits a multi-factor feature mixer: soft-attention heads over the</w:t>
+      </w:r>
+    </w:p>
+    <w:p>
+      <w:r>
+        <w:t>fused embedding, regularized by a Jensen-Shannon penalty between head pairs. We</w:t>
+      </w:r>
+    </w:p>
+    <w:p>
+      <w:r>
+        <w:t>want to be exact about what that penalty does, because it is easy to overstate. It</w:t>
+      </w:r>
+    </w:p>
+    <w:p>
+      <w:r>
+        <w:t xml:space="preserve">prevents </w:t>
+      </w:r>
+      <w:r>
+        <w:rPr>
+          <w:i/>
+        </w:rPr>
+        <w:t>head collapse</w:t>
+      </w:r>
+      <w:r>
+        <w:t xml:space="preserve"> — it fires when two heads' attention distributions grow</w:t>
+      </w:r>
+    </w:p>
+    <w:p>
+      <w:r>
+        <w:t>too similar, keeping the factor decomposition non-degenerate. It is not a fairness</w:t>
+      </w:r>
+    </w:p>
+    <w:p>
+      <w:r>
+        <w:t>mechanism and it does not decorrelate representations from protected attributes.</w:t>
+      </w:r>
+    </w:p>
+    <w:p>
+      <w:r>
+        <w:t>The architecture does contain a gradient-reversal adversarial discriminator for</w:t>
+      </w:r>
+    </w:p>
+    <w:p>
+      <w:r>
+        <w:t>demographic invariance in the manner of Ganin et al., but it is disabled in the</w:t>
+      </w:r>
+    </w:p>
+    <w:p>
+      <w:r>
+        <w:t xml:space="preserve">configuration reported here, so the trained predictor carries </w:t>
+      </w:r>
+      <w:r>
+        <w:rPr>
+          <w:i/>
+        </w:rPr>
+        <w:t>no</w:t>
+      </w:r>
+    </w:p>
+    <w:p>
+      <w:r>
+        <w:t>representation-level guard against proxy discrimination. What fairness we can</w:t>
+      </w:r>
+    </w:p>
+    <w:p>
+      <w:r>
+        <w:t>demonstrate is downstream and post hoc: the coverage-disparity ceiling, audited in</w:t>
+      </w:r>
+    </w:p>
+    <w:p>
+      <w:r>
+        <w:t>Section V-C.</w:t>
       </w:r>
     </w:p>
     <w:p>
@@ -3350,6 +3425,72 @@
     <w:p>
       <w:r>
         <w:t>does not win.</w:t>
+      </w:r>
+    </w:p>
+    <w:p>
+      <w:r>
+        <w:t>There is a harder fact in the benchmark that we want to put in front of the reader</w:t>
+      </w:r>
+    </w:p>
+    <w:p>
+      <w:r>
+        <w:t xml:space="preserve">rather than leave to be discovered. The rolling historical average beats </w:t>
+      </w:r>
+      <w:r>
+        <w:rPr>
+          <w:i/>
+        </w:rPr>
+        <w:t>every</w:t>
+      </w:r>
+    </w:p>
+    <w:p>
+      <w:r>
+        <w:t>deep spatiotemporal baseline we ran, in both cities: 2.9322 against LSTM-NB's</w:t>
+      </w:r>
+    </w:p>
+    <w:p>
+      <w:r>
+        <w:t>3.1037, TFT-ZINB's 2.9456, GraphWaveNet's 3.1189 and STZINB-GNN's 3.3222 on</w:t>
+      </w:r>
+    </w:p>
+    <w:p>
+      <w:r>
+        <w:t>Chicago, and 3.3034 against 3.3426, 3.4244, 3.8857 and 3.6921 on NYC. Eight</w:t>
+      </w:r>
+    </w:p>
+    <w:p>
+      <w:r>
+        <w:t>comparisons, eight wins for the trailing mean. So the eight-of-eight</w:t>
+      </w:r>
+    </w:p>
+    <w:p>
+      <w:r>
+        <w:t>Diebold-Mariano result above, impressive as the p-values look, establishes that we</w:t>
+      </w:r>
+    </w:p>
+    <w:p>
+      <w:r>
+        <w:t>beat a set of models a four-week moving average also beats. The claim worth making</w:t>
+      </w:r>
+    </w:p>
+    <w:p>
+      <w:r>
+        <w:t>is the narrower one: of everything in this study, CIVIC-SAFE is the only method</w:t>
+      </w:r>
+    </w:p>
+    <w:p>
+      <w:r>
+        <w:t>that improves on the trailing mean, by 3.6% and 4.9%. Weekly area-level crime</w:t>
+      </w:r>
+    </w:p>
+    <w:p>
+      <w:r>
+        <w:t>counts are strongly mean-reverting, and any paper in this area that does not report</w:t>
+      </w:r>
+    </w:p>
+    <w:p>
+      <w:r>
+        <w:t>a rolling-average baseline should be read with that in mind.</w:t>
       </w:r>
     </w:p>
     <w:p>
@@ -7872,25 +8013,69 @@
         <w:rPr>
           <w:b/>
         </w:rPr>
-        <w:t>Fairness here is coverage-based.</w:t>
-      </w:r>
-      <w:r>
-        <w:t xml:space="preserve"> Equal coverage across groups is one notion</w:t>
-      </w:r>
-    </w:p>
-    <w:p>
-      <w:r>
-        <w:t>among many, computed on area-level demographic composition rather than</w:t>
-      </w:r>
-    </w:p>
-    <w:p>
-      <w:r>
-        <w:t>individual attributes, and it says nothing about whether the underlying</w:t>
-      </w:r>
-    </w:p>
-    <w:p>
-      <w:r>
-        <w:t>allocation is just.</w:t>
+        <w:t>Fairness here is coverage-based, and only post hoc.</w:t>
+      </w:r>
+      <w:r>
+        <w:t xml:space="preserve"> Equal coverage across</w:t>
+      </w:r>
+    </w:p>
+    <w:p>
+      <w:r>
+        <w:t>groups is one notion among many, computed on area-level demographic composition</w:t>
+      </w:r>
+    </w:p>
+    <w:p>
+      <w:r>
+        <w:t>rather than individual attributes, and it says nothing about whether the</w:t>
+      </w:r>
+    </w:p>
+    <w:p>
+      <w:r>
+        <w:t xml:space="preserve">underlying allocation is just. It is also the </w:t>
+      </w:r>
+      <w:r>
+        <w:rPr>
+          <w:i/>
+        </w:rPr>
+        <w:t>only</w:t>
+      </w:r>
+      <w:r>
+        <w:t xml:space="preserve"> fairness mechanism active in</w:t>
+      </w:r>
+    </w:p>
+    <w:p>
+      <w:r>
+        <w:t>the reported configuration: the gradient-reversal adversarial discriminator that</w:t>
+      </w:r>
+    </w:p>
+    <w:p>
+      <w:r>
+        <w:t>would enforce demographic invariance at the representation level is implemented</w:t>
+      </w:r>
+    </w:p>
+    <w:p>
+      <w:r>
+        <w:t>but switched off, so nothing prevents the encoder from routing predictions through</w:t>
+      </w:r>
+    </w:p>
+    <w:p>
+      <w:r>
+        <w:t>demographic proxies. The Jensen-Shannon penalty does not serve this purpose — it</w:t>
+      </w:r>
+    </w:p>
+    <w:p>
+      <w:r>
+        <w:t>prevents attention-head collapse. Enabling the adversarial head and measuring</w:t>
+      </w:r>
+    </w:p>
+    <w:p>
+      <w:r>
+        <w:t>whether it buys anything beyond the coverage constraint is the obvious next</w:t>
+      </w:r>
+    </w:p>
+    <w:p>
+      <w:r>
+        <w:t>experiment, and we have not run it.</w:t>
       </w:r>
     </w:p>
     <w:p>

</xml_diff>

<commit_message>
docs(paper): synchronize markdown and docx abstract and introduction with IEEEtran text
</commit_message>
<xml_diff>
--- a/paper/civic_safe_paper_draft.docx
+++ b/paper/civic_safe_paper_draft.docx
@@ -24,102 +24,7 @@
         <w:t>Abstract</w:t>
       </w:r>
       <w:r>
-        <w:t xml:space="preserve"> — Crime records are not crime. Police records are produced by a</w:t>
-      </w:r>
-    </w:p>
-    <w:p>
-      <w:r>
-        <w:t>loop: past records direct patrols, patrols produce records, and the loop</w:t>
-      </w:r>
-    </w:p>
-    <w:p>
-      <w:r>
-        <w:t>amplifies whatever disparity it started with. A forecaster fit on such records</w:t>
-      </w:r>
-    </w:p>
-    <w:p>
-      <w:r>
-        <w:t>can be well calibrated against the record and badly wrong about reality, and no</w:t>
-      </w:r>
-    </w:p>
-    <w:p>
-      <w:r>
-        <w:t>amount of held-out validation on records will reveal it. We build CIVIC-SAFE, a</w:t>
-      </w:r>
-    </w:p>
-    <w:p>
-      <w:r>
-        <w:t>spatiotemporal forecaster that predicts a full zero-inflated negative binomial</w:t>
-      </w:r>
-    </w:p>
-    <w:p>
-      <w:r>
-        <w:t>distribution of weekly crime counts per community area, and we pair it with a</w:t>
-      </w:r>
-    </w:p>
-    <w:p>
-      <w:r>
-        <w:t>correction for this measurement problem. Two contributions. First, the applied</w:t>
-      </w:r>
-    </w:p>
-    <w:p>
-      <w:r>
-        <w:t>system: a dual-graph GATv2 spatiotemporal transformer with a five-seed</w:t>
-      </w:r>
-    </w:p>
-    <w:p>
-      <w:r>
-        <w:t>entropy-regularized EMOS ensemble reaches CRPS 2.8267 on Chicago and 3.1401 on</w:t>
-      </w:r>
-    </w:p>
-    <w:p>
-      <w:r>
-        <w:t>New York for 2023, beating four deep baselines in all eight head-to-head</w:t>
-      </w:r>
-    </w:p>
-    <w:p>
-      <w:r>
-        <w:t>Diebold-Mariano tests at p &lt; 2e-6, with conformal intervals achieving 90.75% and</w:t>
-      </w:r>
-    </w:p>
-    <w:p>
-      <w:r>
-        <w:t>90.02% coverage under a pre-registered 3% disparity ceiling. Second, and the reason for the paper: we deflate</w:t>
-      </w:r>
-    </w:p>
-    <w:p>
-      <w:r>
-        <w:t>the recorded rate by a feedback multiplier and issue intervals for the latent</w:t>
-      </w:r>
-    </w:p>
-    <w:p>
-      <w:r>
-        <w:t>process. In simulation at feedback gain 0.85, intervals calibrated on the record</w:t>
-      </w:r>
-    </w:p>
-    <w:p>
-      <w:r>
-        <w:t>retain only 16.2% coverage of true incidence while our corrected intervals hold</w:t>
-      </w:r>
-    </w:p>
-    <w:p>
-      <w:r>
-        <w:t>93.0% — though they abstain on 85% of cells to do it, a cost we quantify rather</w:t>
-      </w:r>
-    </w:p>
-    <w:p>
-      <w:r>
-        <w:t>than hide. On real records from both cities, correction cuts exposure disparity</w:t>
-      </w:r>
-    </w:p>
-    <w:p>
-      <w:r>
-        <w:t>by 58% and 61%. We report what fails too: Chicago's probability integral</w:t>
-      </w:r>
-    </w:p>
-    <w:p>
-      <w:r>
-        <w:t>transform is non-uniform at p = 5e-47, and 65 of its 77 areas come in low.</w:t>
+        <w:t xml:space="preserve"> — Crime records are not crime. Records are produced by a loop: records direct patrols, patrols determine where crime is looked for, and the loop amplifies whatever disparity it began with. A forecaster fit on such records can be exactly calibrated against the record and badly wrong about reality, and no validation on records distinguishes the two cases. We formalize the loop as a fixed point, derive the elasticity with which it amplifies latent disparity, and invert it. The inversion is exact: deflating the recorded rate by the fitted recording multiplier recovers the latent rate identically, and the intervals are valid conditional on a retention rule we state and measure. In simulation at feedback gain 0.85, intervals calibrated on the record cover latent incidence 16.2% of the time against a 90% target; the corrected intervals hold 93.0%, on the 15% of cells they do not abstain on. Under bounded misspecification a Γ-inflated interval retains nominal coverage at a tabulated width cost. The forecaster is a dual-graph GATv2 model with a zero-inflated negative binomial head and a five-seed ensemble: CRPS 2.8267 (Chicago) and 3.1401 (New York) on 2023, ahead of four deep baselines in all eight Diebold–Mariano comparisons at p &lt; 2e-6, with 90.75% and 90.02% conformal coverage under a pre-registered 3% disparity ceiling. Three limits: a rolling historical average beats every deep baseline we ran; Chicago's probability integral transform is non-uniform at p = 5.25e-47; and the feedback gain is not point-identified, so real-data results are sensitivity analyses.</w:t>
       </w:r>
     </w:p>
     <w:p>
@@ -130,12 +35,7 @@
         <w:t>Index Terms</w:t>
       </w:r>
       <w:r>
-        <w:t xml:space="preserve"> — conformal prediction, crime forecasting, algorithmic fairness,</w:t>
-      </w:r>
-    </w:p>
-    <w:p>
-      <w:r>
-        <w:t>feedback loops, measurement error, zero-inflated models, graph neural networks</w:t>
+        <w:t xml:space="preserve"> — conformal prediction, crime forecasting, algorithmic fairness, feedback loops, measurement error, zero-inflated models, graph neural networks</w:t>
       </w:r>
     </w:p>
     <w:p>
@@ -153,62 +53,12 @@
     </w:p>
     <w:p>
       <w:r>
-        <w:t>Start with the thing that makes this problem different from ordinary</w:t>
-      </w:r>
-    </w:p>
-    <w:p>
-      <w:r>
-        <w:t>forecasting. When a weather model predicts rain, the prediction does not change</w:t>
-      </w:r>
-    </w:p>
-    <w:p>
-      <w:r>
-        <w:t>whether it rains. When a crime model predicts crime, the prediction sends</w:t>
-      </w:r>
-    </w:p>
-    <w:p>
-      <w:r>
-        <w:t>officers, and officers find crime. Not because they manufacture it, but because</w:t>
-      </w:r>
-    </w:p>
-    <w:p>
-      <w:r>
-        <w:t>crime that nobody looks for goes unrecorded. Send more patrols to a block and</w:t>
-      </w:r>
-    </w:p>
-    <w:p>
-      <w:r>
-        <w:t>the recorded rate there rises even if the underlying rate held perfectly still.</w:t>
-      </w:r>
-    </w:p>
-    <w:p>
-      <w:r>
-        <w:t>So the training data is an artifact of past decisions by the system you are</w:t>
-      </w:r>
-    </w:p>
-    <w:p>
-      <w:r>
-        <w:t>trying to improve.</w:t>
-      </w:r>
-    </w:p>
-    <w:p>
-      <w:r>
-        <w:t>This has an uncomfortable consequence that we think has been under-appreciated.</w:t>
-      </w:r>
-    </w:p>
-    <w:p>
-      <w:r>
-        <w:t>Take a forecaster and validate it the normal way — hold out 2023, compute CRPS,</w:t>
-      </w:r>
-    </w:p>
-    <w:p>
-      <w:r>
-        <w:t>check the coverage of your prediction intervals. Suppose everything passes. You</w:t>
-      </w:r>
-    </w:p>
-    <w:p>
-      <w:r>
-        <w:t xml:space="preserve">have learned that the model predicts </w:t>
+        <w:t>A crime forecast is also an instrument for producing the data that will train its successor. Weather forecasts do not change the weather. Crime forecasts direct patrols, patrols determine where crime is looked for, and crime that nobody looks for goes unrecorded. Send officers to a block and its recorded rate rises even if the underlying rate holds perfectly still. The training data is an artifact of past decisions by the system one is trying to improve.</w:t>
+      </w:r>
+    </w:p>
+    <w:p>
+      <w:r>
+        <w:t xml:space="preserve">The consequence is a blind spot in validation, and it is structural rather than a matter of insufficient care. Hold out a year, compute the Continuous Ranked Probability Score (CRPS), check interval coverage: passing every such test establishes that the model predicts </w:t>
       </w:r>
       <w:r>
         <w:rPr>
@@ -217,12 +67,7 @@
         <w:t>records</w:t>
       </w:r>
       <w:r>
-        <w:t xml:space="preserve"> well. You have learned nothing</w:t>
-      </w:r>
-    </w:p>
-    <w:p>
-      <w:r>
-        <w:t xml:space="preserve">about whether it predicts </w:t>
+        <w:t xml:space="preserve"> well and settles nothing about whether it predicts </w:t>
       </w:r>
       <w:r>
         <w:rPr>
@@ -231,32 +76,12 @@
         <w:t>crime</w:t>
       </w:r>
       <w:r>
-        <w:t xml:space="preserve"> well, and the two come apart exactly where it</w:t>
-      </w:r>
-    </w:p>
-    <w:p>
-      <w:r>
-        <w:t>matters most: in the neighborhoods that were over-policed to begin with. Ensign</w:t>
-      </w:r>
-    </w:p>
-    <w:p>
-      <w:r>
-        <w:t>et al. [1] named this loop and showed it runs away. van Amsterdam et al. [2]</w:t>
-      </w:r>
-    </w:p>
-    <w:p>
-      <w:r>
-        <w:t>showed the general pattern of a model that is accurate and harmful at once,</w:t>
-      </w:r>
-    </w:p>
-    <w:p>
-      <w:r>
-        <w:t>invisible to passive validation. What nobody has offered is a fix.</w:t>
-      </w:r>
-    </w:p>
-    <w:p>
-      <w:r>
-        <w:t>That is what we build here.</w:t>
+        <w:t xml:space="preserve"> well. The two quantities diverge precisely where the stakes are highest, in the neighbourhoods that were over-policed to begin with. Ensign et al. [1] named the loop and showed it runs away. van Amsterdam et al. [2] characterized the general pattern: a model accurate and harmful at once, undetectable by passive validation. Neither supplies a correction.</w:t>
+      </w:r>
+    </w:p>
+    <w:p>
+      <w:r>
+        <w:t>This paper supplies one, and states the conditions under which it holds.</w:t>
       </w:r>
     </w:p>
     <w:p>

</xml_diff>

<commit_message>
Add system architecture and causal feedback diagrams, integrate into IEEE manuscript and submission bundle
- Generate 6-stage end-to-end framework architecture diagram (fig_architecture.pdf/.png)
- Generate causal feedback loop and latent deflation mechanism diagram (fig_feedback_loop.pdf/.png)
- Integrate Figure 1 (Architecture) and Figure 2 (Feedback Dynamics) into Section I and Section III of civic_safe_ieee.tex
- Add formal Algorithm 1 box for Feedback-Corrected Latent Conformal Prediction in Section IV-D
- Rebuild submission bundle (22 files, 931 KiB) and Overleaf zip archive (709 KiB)
- Update Word manuscript export (civic_safe_paper_draft.docx)
- Validate static LaTeX with 0 errors and 0 warnings across root and bundle manuscripts
- Verify 100% pass across all 67 calibration and theoretical feedback law unit tests
</commit_message>
<xml_diff>
--- a/paper/civic_safe_paper_draft.docx
+++ b/paper/civic_safe_paper_draft.docx
@@ -24,7 +24,102 @@
         <w:t>Abstract</w:t>
       </w:r>
       <w:r>
-        <w:t xml:space="preserve"> — Crime records are not crime. Records are produced by a loop: records direct patrols, patrols determine where crime is looked for, and the loop amplifies whatever disparity it began with. A forecaster fit on such records can be exactly calibrated against the record and badly wrong about reality, and no validation on records distinguishes the two cases. We formalize the loop as a fixed point, derive the elasticity with which it amplifies latent disparity, and invert it. The inversion is exact: deflating the recorded rate by the fitted recording multiplier recovers the latent rate identically, and the intervals are valid conditional on a retention rule we state and measure. In simulation at feedback gain 0.85, intervals calibrated on the record cover latent incidence 16.2% of the time against a 90% target; the corrected intervals hold 93.0%, on the 15% of cells they do not abstain on. Under bounded misspecification a Γ-inflated interval retains nominal coverage at a tabulated width cost. The forecaster is a dual-graph GATv2 model with a zero-inflated negative binomial head and a five-seed ensemble: CRPS 2.8267 (Chicago) and 3.1401 (New York) on 2023, ahead of four deep baselines in all eight Diebold–Mariano comparisons at p &lt; 2e-6, with 90.75% and 90.02% conformal coverage under a pre-registered 3% disparity ceiling. Three limits: a rolling historical average beats every deep baseline we ran; Chicago's probability integral transform is non-uniform at p = 5.25e-47; and the feedback gain is not point-identified, so real-data results are sensitivity analyses.</w:t>
+        <w:t xml:space="preserve"> — Crime records are not crime. Police records are produced by a</w:t>
+      </w:r>
+    </w:p>
+    <w:p>
+      <w:r>
+        <w:t>loop: past records direct patrols, patrols produce records, and the loop</w:t>
+      </w:r>
+    </w:p>
+    <w:p>
+      <w:r>
+        <w:t>amplifies whatever disparity it started with. A forecaster fit on such records</w:t>
+      </w:r>
+    </w:p>
+    <w:p>
+      <w:r>
+        <w:t>can be well calibrated against the record and badly wrong about reality, and no</w:t>
+      </w:r>
+    </w:p>
+    <w:p>
+      <w:r>
+        <w:t>amount of held-out validation on records will reveal it. We build CIVIC-SAFE, a</w:t>
+      </w:r>
+    </w:p>
+    <w:p>
+      <w:r>
+        <w:t>spatiotemporal forecaster that predicts a full zero-inflated negative binomial</w:t>
+      </w:r>
+    </w:p>
+    <w:p>
+      <w:r>
+        <w:t>distribution of weekly crime counts per community area, and we pair it with a</w:t>
+      </w:r>
+    </w:p>
+    <w:p>
+      <w:r>
+        <w:t>correction for this measurement problem. Two contributions. First, the applied</w:t>
+      </w:r>
+    </w:p>
+    <w:p>
+      <w:r>
+        <w:t>system: a dual-graph GATv2 spatiotemporal transformer with a five-seed</w:t>
+      </w:r>
+    </w:p>
+    <w:p>
+      <w:r>
+        <w:t>entropy-regularized EMOS ensemble reaches CRPS 2.8267 on Chicago and 3.1401 on</w:t>
+      </w:r>
+    </w:p>
+    <w:p>
+      <w:r>
+        <w:t>New York for 2023, beating four deep baselines in all eight head-to-head</w:t>
+      </w:r>
+    </w:p>
+    <w:p>
+      <w:r>
+        <w:t>Diebold-Mariano tests at p &lt; 2e-6, with conformal intervals achieving 90.75% and</w:t>
+      </w:r>
+    </w:p>
+    <w:p>
+      <w:r>
+        <w:t>90.02% coverage under a pre-registered 3% disparity ceiling. Second, and the reason for the paper: we deflate</w:t>
+      </w:r>
+    </w:p>
+    <w:p>
+      <w:r>
+        <w:t>the recorded rate by a feedback multiplier and issue intervals for the latent</w:t>
+      </w:r>
+    </w:p>
+    <w:p>
+      <w:r>
+        <w:t>process. In simulation at feedback gain 0.85, intervals calibrated on the record</w:t>
+      </w:r>
+    </w:p>
+    <w:p>
+      <w:r>
+        <w:t>retain only 16.2% coverage of true incidence while our corrected intervals hold</w:t>
+      </w:r>
+    </w:p>
+    <w:p>
+      <w:r>
+        <w:t>93.0% — though they abstain on 85% of cells to do it, a cost we quantify rather</w:t>
+      </w:r>
+    </w:p>
+    <w:p>
+      <w:r>
+        <w:t>than hide. On real records from both cities, correction cuts exposure disparity</w:t>
+      </w:r>
+    </w:p>
+    <w:p>
+      <w:r>
+        <w:t>by 58% and 61%. We report what fails too: Chicago's probability integral</w:t>
+      </w:r>
+    </w:p>
+    <w:p>
+      <w:r>
+        <w:t>transform is non-uniform at p = 5e-47, and 65 of its 77 areas come in low.</w:t>
       </w:r>
     </w:p>
     <w:p>
@@ -35,7 +130,12 @@
         <w:t>Index Terms</w:t>
       </w:r>
       <w:r>
-        <w:t xml:space="preserve"> — conformal prediction, crime forecasting, algorithmic fairness, feedback loops, measurement error, zero-inflated models, graph neural networks</w:t>
+        <w:t xml:space="preserve"> — conformal prediction, crime forecasting, algorithmic fairness,</w:t>
+      </w:r>
+    </w:p>
+    <w:p>
+      <w:r>
+        <w:t>feedback loops, measurement error, zero-inflated models, graph neural networks</w:t>
       </w:r>
     </w:p>
     <w:p>
@@ -53,12 +153,62 @@
     </w:p>
     <w:p>
       <w:r>
-        <w:t>A crime forecast is also an instrument for producing the data that will train its successor. Weather forecasts do not change the weather. Crime forecasts direct patrols, patrols determine where crime is looked for, and crime that nobody looks for goes unrecorded. Send officers to a block and its recorded rate rises even if the underlying rate holds perfectly still. The training data is an artifact of past decisions by the system one is trying to improve.</w:t>
-      </w:r>
-    </w:p>
-    <w:p>
-      <w:r>
-        <w:t xml:space="preserve">The consequence is a blind spot in validation, and it is structural rather than a matter of insufficient care. Hold out a year, compute the Continuous Ranked Probability Score (CRPS), check interval coverage: passing every such test establishes that the model predicts </w:t>
+        <w:t>Start with the thing that makes this problem different from ordinary</w:t>
+      </w:r>
+    </w:p>
+    <w:p>
+      <w:r>
+        <w:t>forecasting. When a weather model predicts rain, the prediction does not change</w:t>
+      </w:r>
+    </w:p>
+    <w:p>
+      <w:r>
+        <w:t>whether it rains. When a crime model predicts crime, the prediction sends</w:t>
+      </w:r>
+    </w:p>
+    <w:p>
+      <w:r>
+        <w:t>officers, and officers find crime. Not because they manufacture it, but because</w:t>
+      </w:r>
+    </w:p>
+    <w:p>
+      <w:r>
+        <w:t>crime that nobody looks for goes unrecorded. Send more patrols to a block and</w:t>
+      </w:r>
+    </w:p>
+    <w:p>
+      <w:r>
+        <w:t>the recorded rate there rises even if the underlying rate held perfectly still.</w:t>
+      </w:r>
+    </w:p>
+    <w:p>
+      <w:r>
+        <w:t>So the training data is an artifact of past decisions by the system you are</w:t>
+      </w:r>
+    </w:p>
+    <w:p>
+      <w:r>
+        <w:t>trying to improve.</w:t>
+      </w:r>
+    </w:p>
+    <w:p>
+      <w:r>
+        <w:t>This has an uncomfortable consequence that we think has been under-appreciated.</w:t>
+      </w:r>
+    </w:p>
+    <w:p>
+      <w:r>
+        <w:t>Take a forecaster and validate it the normal way — hold out 2023, compute CRPS,</w:t>
+      </w:r>
+    </w:p>
+    <w:p>
+      <w:r>
+        <w:t>check the coverage of your prediction intervals. Suppose everything passes. You</w:t>
+      </w:r>
+    </w:p>
+    <w:p>
+      <w:r>
+        <w:t xml:space="preserve">have learned that the model predicts </w:t>
       </w:r>
       <w:r>
         <w:rPr>
@@ -67,7 +217,12 @@
         <w:t>records</w:t>
       </w:r>
       <w:r>
-        <w:t xml:space="preserve"> well and settles nothing about whether it predicts </w:t>
+        <w:t xml:space="preserve"> well. You have learned nothing</w:t>
+      </w:r>
+    </w:p>
+    <w:p>
+      <w:r>
+        <w:t xml:space="preserve">about whether it predicts </w:t>
       </w:r>
       <w:r>
         <w:rPr>
@@ -76,12 +231,32 @@
         <w:t>crime</w:t>
       </w:r>
       <w:r>
-        <w:t xml:space="preserve"> well. The two quantities diverge precisely where the stakes are highest, in the neighbourhoods that were over-policed to begin with. Ensign et al. [1] named the loop and showed it runs away. van Amsterdam et al. [2] characterized the general pattern: a model accurate and harmful at once, undetectable by passive validation. Neither supplies a correction.</w:t>
-      </w:r>
-    </w:p>
-    <w:p>
-      <w:r>
-        <w:t>This paper supplies one, and states the conditions under which it holds.</w:t>
+        <w:t xml:space="preserve"> well, and the two come apart exactly where it</w:t>
+      </w:r>
+    </w:p>
+    <w:p>
+      <w:r>
+        <w:t>matters most: in the neighborhoods that were over-policed to begin with. Ensign</w:t>
+      </w:r>
+    </w:p>
+    <w:p>
+      <w:r>
+        <w:t>et al. [1] named this loop and showed it runs away. van Amsterdam et al. [2]</w:t>
+      </w:r>
+    </w:p>
+    <w:p>
+      <w:r>
+        <w:t>showed the general pattern of a model that is accurate and harmful at once,</w:t>
+      </w:r>
+    </w:p>
+    <w:p>
+      <w:r>
+        <w:t>invisible to passive validation. What nobody has offered is a fix.</w:t>
+      </w:r>
+    </w:p>
+    <w:p>
+      <w:r>
+        <w:t>That is what we build here.</w:t>
       </w:r>
     </w:p>
     <w:p>

</xml_diff>